<commit_message>
docs: o oitavo achado e os dois níveis de pull request
Integrar uma onda faz o GitHub marcar os PRs daquela onda como MERGED
sozinho, sem revisão de ninguém. É comportamento normal de stacked PRs e
consequência direta da correção do achado 7, então virou o achado 8 — o
único da palestra que foi criado pela correção de outro.

Deck: slide de achados novo, pipeline com PR por item e PR de entrega
separados, demo 4 mostrando os dois níveis, e o não-negociável trocado de
"merge humano" para "um PR que proponha mexer no main, que nenhum agente
possa aprovar" — que é a versão verificável da mesma regra.

Roteiro: numeração dos slides deslocada, callout explicando o par 7/8, o
que apontar no PR de entrega, e uma resposta pronta para "vi PRs marcados
como MERGED, quem aprovou aquilo?".

Co-Authored-By: Claude Opus 5 (1M context) <noreply@anthropic.com>
</commit_message>
<xml_diff>
--- a/docs/apresentacao/Roteiro-Agent-Squad-TDC-SP-2026.docx
+++ b/docs/apresentacao/Roteiro-Agent-Squad-TDC-SP-2026.docx
@@ -1619,7 +1619,7 @@
                 <w:color w:val="1A1D22"/>
                 <w:sz w:val="19"/>
               </w:rPr>
-              <w:t>49–56</w:t>
+              <w:t>49–57</w:t>
             </w:r>
           </w:p>
         </w:tc>
@@ -1655,7 +1655,7 @@
                 <w:color w:val="1A1D22"/>
                 <w:sz w:val="19"/>
               </w:rPr>
-              <w:t>22–30</w:t>
+              <w:t>22–31</w:t>
             </w:r>
           </w:p>
         </w:tc>
@@ -1673,7 +1673,7 @@
                 <w:color w:val="1A1D22"/>
                 <w:sz w:val="19"/>
               </w:rPr>
-              <w:t>Sete coisas que quebraram</w:t>
+              <w:t>Oito coisas que quebraram</w:t>
             </w:r>
           </w:p>
         </w:tc>
@@ -1693,7 +1693,7 @@
                 <w:color w:val="1A1D22"/>
                 <w:sz w:val="19"/>
               </w:rPr>
-              <w:t>56–59</w:t>
+              <w:t>57–59</w:t>
             </w:r>
           </w:p>
         </w:tc>
@@ -1729,7 +1729,7 @@
                 <w:color w:val="1A1D22"/>
                 <w:sz w:val="19"/>
               </w:rPr>
-              <w:t>31–33</w:t>
+              <w:t>32–34</w:t>
             </w:r>
           </w:p>
         </w:tc>
@@ -1803,7 +1803,7 @@
                 <w:color w:val="1A1D22"/>
                 <w:sz w:val="19"/>
               </w:rPr>
-              <w:t>34</w:t>
+              <w:t>35</w:t>
             </w:r>
           </w:p>
         </w:tc>
@@ -1877,7 +1877,7 @@
                 <w:color w:val="1A1D22"/>
                 <w:sz w:val="19"/>
               </w:rPr>
-              <w:t>35</w:t>
+              <w:t>36</w:t>
             </w:r>
           </w:p>
         </w:tc>
@@ -3376,7 +3376,7 @@
           <w:color w:val="1A1D22"/>
           <w:sz w:val="21"/>
         </w:rPr>
-        <w:t>Abra UM pull request e role pelo corpo, apontando:</w:t>
+        <w:t>Abra UM pull request de item e role pelo corpo, apontando:</w:t>
       </w:r>
     </w:p>
     <w:p>
@@ -3461,6 +3461,20 @@
     </w:p>
     <w:p>
       <w:pPr>
+        <w:spacing w:after="100" w:before="0"/>
+      </w:pPr>
+      <w:r>
+        <w:rPr>
+          <w:b w:val="0"/>
+          <w:i w:val="0"/>
+          <w:color w:val="1A1D22"/>
+          <w:sz w:val="21"/>
+        </w:rPr>
+        <w:t>Depois volte à lista e abra o PR de entrega — o que vai de agent/run-... para main:</w:t>
+      </w:r>
+    </w:p>
+    <w:p>
+      <w:pPr>
         <w:spacing w:after="80"/>
         <w:ind w:left="340"/>
       </w:pPr>
@@ -3476,7 +3490,102 @@
           <w:color w:val="1A1D22"/>
           <w:sz w:val="21"/>
         </w:rPr>
-        <w:t>Todos são draft, e a label agent-generated. O merge é humano — sempre.</w:t>
+        <w:t>A tabela de entrega: cada issue, a área, se passou no gate e quantas tentativas levou</w:t>
+      </w:r>
+    </w:p>
+    <w:p>
+      <w:pPr>
+        <w:spacing w:after="80"/>
+        <w:ind w:left="340"/>
+      </w:pPr>
+      <w:r>
+        <w:rPr>
+          <w:b/>
+          <w:color w:val="1F5FBF"/>
+        </w:rPr>
+        <w:t xml:space="preserve">•  </w:t>
+      </w:r>
+      <w:r>
+        <w:rPr>
+          <w:color w:val="1A1D22"/>
+          <w:sz w:val="21"/>
+        </w:rPr>
+        <w:t>A seção "O que não entrou", quando houver — é o que separa relatório de propaganda</w:t>
+      </w:r>
+    </w:p>
+    <w:p>
+      <w:pPr>
+        <w:spacing w:after="80"/>
+        <w:ind w:left="340"/>
+      </w:pPr>
+      <w:r>
+        <w:rPr>
+          <w:b/>
+          <w:color w:val="1F5FBF"/>
+        </w:rPr>
+        <w:t xml:space="preserve">•  </w:t>
+      </w:r>
+      <w:r>
+        <w:rPr>
+          <w:color w:val="1A1D22"/>
+          <w:sz w:val="21"/>
+        </w:rPr>
+        <w:t>As decisões que a fábrica tomou sem perguntar, num bloco recolhível</w:t>
+      </w:r>
+    </w:p>
+    <w:p>
+      <w:pPr>
+        <w:spacing w:after="80"/>
+        <w:ind w:left="340"/>
+      </w:pPr>
+      <w:r>
+        <w:rPr>
+          <w:b/>
+          <w:color w:val="1F5FBF"/>
+        </w:rPr>
+        <w:t xml:space="preserve">•  </w:t>
+      </w:r>
+      <w:r>
+        <w:rPr>
+          <w:color w:val="1A1D22"/>
+          <w:sz w:val="21"/>
+        </w:rPr>
+        <w:t>A última linha do corpo: "O merge é seu."</w:t>
+      </w:r>
+    </w:p>
+    <w:p>
+      <w:pPr>
+        <w:spacing w:before="180" w:after="0"/>
+        <w:ind w:left="113"/>
+        <w:shd w:val="clear" w:fill="F3EEFA"/>
+        <w:pBdr>
+          <w:left w:val="single" w:sz="18" w:space="8" w:color="6B3FA0"/>
+        </w:pBdr>
+      </w:pPr>
+      <w:r>
+        <w:rPr>
+          <w:b/>
+          <w:color w:val="6B3FA0"/>
+          <w:sz w:val="21"/>
+        </w:rPr>
+        <w:t>Explique os dois níveis antes que alguém pergunte</w:t>
+      </w:r>
+    </w:p>
+    <w:p>
+      <w:pPr>
+        <w:spacing w:before="0" w:after="200"/>
+        <w:ind w:left="113"/>
+        <w:shd w:val="clear" w:fill="F3EEFA"/>
+        <w:pBdr>
+          <w:left w:val="single" w:sz="18" w:space="8" w:color="6B3FA0"/>
+        </w:pBdr>
+      </w:pPr>
+      <w:r>
+        <w:rPr>
+          <w:color w:val="1A1D22"/>
+          <w:sz w:val="21"/>
+        </w:rPr>
+        <w:t>Os PRs por item apontam para o branch de integração e servem para LER uma mudança de cada vez. O PR de entrega é a única coisa da execução que propõe mexer no main. Alguns PRs de item vão aparecer como MERGED — o GitHub faz isso sozinho quando os commits viram alcançáveis pela base. Diga isso ANTES de alguém apontar, e emende no achado 8. Em uma frase: "revisar em pedaços, decidir de uma vez".</w:t>
       </w:r>
     </w:p>
     <w:p>
@@ -3490,7 +3599,7 @@
           <w:color w:val="1A1D22"/>
           <w:sz w:val="27"/>
         </w:rPr>
-        <w:t>Os achados — slides 22 a 30 · 7 min</w:t>
+        <w:t>Os achados — slides 22 a 31 · 8 min</w:t>
       </w:r>
     </w:p>
     <w:p>
@@ -3512,7 +3621,7 @@
           <w:color w:val="5B636E"/>
           <w:sz w:val="18"/>
         </w:rPr>
-        <w:t>22–30</w:t>
+        <w:t>22–31</w:t>
       </w:r>
     </w:p>
     <w:p>
@@ -3553,7 +3662,7 @@
           <w:color w:val="1A1D22"/>
           <w:sz w:val="21"/>
         </w:rPr>
-        <w:t>Sete slides, ~50 segundos cada. Não se demore em nenhum — o valor está no conjunto. Se precisar cortar, corte o achado 4 (worktree) e o 5 (NuGet): são os mais específicos de Windows.</w:t>
+        <w:t>Oito slides, ~50 segundos cada. Não se demore em nenhum — o valor está no conjunto. Se precisar cortar, corte o achado 4 (worktree) e o 5 (NuGet): são os mais específicos de Windows.</w:t>
       </w:r>
     </w:p>
     <w:p>
@@ -3593,7 +3702,42 @@
     </w:p>
     <w:p>
       <w:pPr>
-        <w:spacing w:after="160" w:before="0"/>
+        <w:spacing w:before="180" w:after="0"/>
+        <w:ind w:left="113"/>
+        <w:shd w:val="clear" w:fill="F3EEFA"/>
+        <w:pBdr>
+          <w:left w:val="single" w:sz="18" w:space="8" w:color="6B3FA0"/>
+        </w:pBdr>
+      </w:pPr>
+      <w:r>
+        <w:rPr>
+          <w:b/>
+          <w:color w:val="6B3FA0"/>
+          <w:sz w:val="21"/>
+        </w:rPr>
+        <w:t>Os achados 7 e 8 são um par. Conte na ordem.</w:t>
+      </w:r>
+    </w:p>
+    <w:p>
+      <w:pPr>
+        <w:spacing w:before="0" w:after="200"/>
+        <w:ind w:left="113"/>
+        <w:shd w:val="clear" w:fill="F3EEFA"/>
+        <w:pBdr>
+          <w:left w:val="single" w:sz="18" w:space="8" w:color="6B3FA0"/>
+        </w:pBdr>
+      </w:pPr>
+      <w:r>
+        <w:rPr>
+          <w:color w:val="1A1D22"/>
+          <w:sz w:val="21"/>
+        </w:rPr>
+        <w:t>O 7 é o problema: as ondas não se enxergavam, então criei um branch de integração. O 8 é o preço dessa correção: quando a integração avança, o GitHub marca os PRs daquela onda como MERGED sozinho — os commits deles viraram alcançáveis pela base. Três PRs "mergeados" sem revisão nenhuma. É comportamento normal de stacked PRs, não bug do GitHub, mas deixava a execução terminar sem nada para aprovar. A correção final: um PR de entrega, do branch de integração para main, em draft. A frase: "os PRs por item são unidades de revisão; o PR de entrega é o portão".</w:t>
+      </w:r>
+    </w:p>
+    <w:p>
+      <w:pPr>
+        <w:spacing w:after="120" w:before="0"/>
       </w:pPr>
       <w:r>
         <w:rPr>
@@ -3602,7 +3746,21 @@
           <w:color w:val="1A1D22"/>
           <w:sz w:val="21"/>
         </w:rPr>
-        <w:t>Slide 30 é a tese da palestra em quatro linhas. Se alguém for embora depois disso, levou o essencial: construir uma fábrica de agentes é 20% prompt e 80% engenharia de integração e verificação.</w:t>
+        <w:t>Se alguém apontar os PRs MERGED na tela durante a demo 4, ótimo — é exatamente a deixa do achado 8. Diga: "boa, você acabou de achar o meu oitavo achado".</w:t>
+      </w:r>
+    </w:p>
+    <w:p>
+      <w:pPr>
+        <w:spacing w:after="160" w:before="0"/>
+      </w:pPr>
+      <w:r>
+        <w:rPr>
+          <w:b w:val="0"/>
+          <w:i w:val="0"/>
+          <w:color w:val="1A1D22"/>
+          <w:sz w:val="21"/>
+        </w:rPr>
+        <w:t>Slide 31 é a tese da palestra em quatro linhas. Se alguém for embora depois disso, levou o essencial: construir uma fábrica de agentes é 20% prompt e 80% engenharia de integração e verificação.</w:t>
       </w:r>
     </w:p>
     <w:p>
@@ -3616,7 +3774,7 @@
           <w:color w:val="1A1D22"/>
           <w:sz w:val="27"/>
         </w:rPr>
-        <w:t>Na sua empresa — slides 31 a 33 · 5 min</w:t>
+        <w:t>Na sua empresa — slides 32 a 34 · 3 min</w:t>
       </w:r>
     </w:p>
     <w:p>
@@ -3638,7 +3796,7 @@
           <w:color w:val="5B636E"/>
           <w:sz w:val="18"/>
         </w:rPr>
-        <w:t>31–33</w:t>
+        <w:t>32–34</w:t>
       </w:r>
     </w:p>
     <w:p>
@@ -3652,7 +3810,7 @@
           <w:color w:val="1A1D22"/>
           <w:sz w:val="21"/>
         </w:rPr>
-        <w:t>Slide 31 é o mais prático da palestra e a plateia está esperando por ele. Enfatize o passo 2:</w:t>
+        <w:t>Slide 32 é o mais prático da palestra e a plateia está esperando por ele. Enfatize o passo 2:</w:t>
       </w:r>
     </w:p>
     <w:p>
@@ -3679,7 +3837,7 @@
           <w:color w:val="1A1D22"/>
           <w:sz w:val="21"/>
         </w:rPr>
-        <w:t>Slide 32: leia os seis não-negociáveis devagar. Cada um é uma conversa que a pessoa vai ter com segurança, com compliance ou com o diretor dela. Ter a resposta pronta é o que faz o projeto ser aprovado.</w:t>
+        <w:t>Slide 33: leia os seis não-negociáveis devagar. Cada um é uma conversa que a pessoa vai ter com segurança, com compliance ou com o diretor dela. Ter a resposta pronta é o que faz o projeto ser aprovado.</w:t>
       </w:r>
     </w:p>
     <w:p>
@@ -3697,7 +3855,7 @@
           <w:color w:val="B32D2D"/>
           <w:sz w:val="21"/>
         </w:rPr>
-        <w:t>Slide 33 — não corte por falta de tempo</w:t>
+        <w:t>Slide 34 — não corte por falta de tempo</w:t>
       </w:r>
     </w:p>
     <w:p>
@@ -3728,7 +3886,7 @@
           <w:color w:val="1A1D22"/>
           <w:sz w:val="27"/>
         </w:rPr>
-        <w:t>Fecho — slide 34 · 1 min</w:t>
+        <w:t>Fecho — slide 35 · 1 min</w:t>
       </w:r>
     </w:p>
     <w:p>
@@ -3750,7 +3908,7 @@
           <w:color w:val="5B636E"/>
           <w:sz w:val="18"/>
         </w:rPr>
-        <w:t>34</w:t>
+        <w:t>35</w:t>
       </w:r>
     </w:p>
     <w:p>
@@ -4459,6 +4617,48 @@
           <w:color w:val="1A1D22"/>
           <w:sz w:val="22"/>
         </w:rPr>
+        <w:t>Vi PRs marcados como MERGED. Quem aprovou aquilo?</w:t>
+      </w:r>
+    </w:p>
+    <w:p>
+      <w:pPr>
+        <w:spacing w:after="220"/>
+      </w:pPr>
+      <w:r>
+        <w:rPr>
+          <w:b/>
+          <w:color w:val="5B636E"/>
+          <w:sz w:val="21"/>
+        </w:rPr>
+        <w:t xml:space="preserve">R.  </w:t>
+      </w:r>
+      <w:r>
+        <w:rPr>
+          <w:b w:val="0"/>
+          <w:color w:val="1A1D22"/>
+          <w:sz w:val="21"/>
+        </w:rPr>
+        <w:t>Ninguém — e essa é a resposta honesta. O GitHub marca um PR como merged quando os commits dele passam a ser alcançáveis pela base, e é isso que a integração entre ondas faz. Comportamento normal de stacked PRs. Por isso a execução termina abrindo um PR de entrega, do branch de integração para main, em draft: os PRs por item são unidades de revisão, o de entrega é o portão. Foi o meu achado número 8.</w:t>
+      </w:r>
+    </w:p>
+    <w:p>
+      <w:pPr>
+        <w:spacing w:after="60"/>
+      </w:pPr>
+      <w:r>
+        <w:rPr>
+          <w:b/>
+          <w:color w:val="1F5FBF"/>
+          <w:sz w:val="22"/>
+        </w:rPr>
+        <w:t xml:space="preserve">P.  </w:t>
+      </w:r>
+      <w:r>
+        <w:rPr>
+          <w:b/>
+          <w:color w:val="1A1D22"/>
+          <w:sz w:val="22"/>
+        </w:rPr>
         <w:t>Por que não usou o grafo de workflows do Agent Framework?</w:t>
       </w:r>
     </w:p>

</xml_diff>

<commit_message>
docs: achado reserva para a espera do planejamento no roteiro
A história do inventário lendo a execução anterior não ganhou slide — o
deck já está cheio para uma hora — mas cabe exatamente na espera de 4 a 6
minutos do planejamento, que é onde o roteiro pede assunto.

Co-Authored-By: Claude Opus 5 (1M context) <noreply@anthropic.com>
</commit_message>
<xml_diff>
--- a/docs/apresentacao/Roteiro-Agent-Squad-TDC-SP-2026.docx
+++ b/docs/apresentacao/Roteiro-Agent-Squad-TDC-SP-2026.docx
@@ -3089,6 +3089,41 @@
     </w:p>
     <w:p>
       <w:pPr>
+        <w:spacing w:before="180" w:after="0"/>
+        <w:ind w:left="113"/>
+        <w:shd w:val="clear" w:fill="F3EEFA"/>
+        <w:pBdr>
+          <w:left w:val="single" w:sz="18" w:space="8" w:color="6B3FA0"/>
+        </w:pBdr>
+      </w:pPr>
+      <w:r>
+        <w:rPr>
+          <w:b/>
+          <w:color w:val="6B3FA0"/>
+          <w:sz w:val="21"/>
+        </w:rPr>
+        <w:t>Achado reserva, para a espera do planejamento</w:t>
+      </w:r>
+    </w:p>
+    <w:p>
+      <w:pPr>
+        <w:spacing w:before="0" w:after="200"/>
+        <w:ind w:left="113"/>
+        <w:shd w:val="clear" w:fill="F3EEFA"/>
+        <w:pBdr>
+          <w:left w:val="single" w:sz="18" w:space="8" w:color="6B3FA0"/>
+        </w:pBdr>
+      </w:pPr>
+      <w:r>
+        <w:rPr>
+          <w:color w:val="1A1D22"/>
+          <w:sz w:val="21"/>
+        </w:rPr>
+        <w:t>Tem uma história de bastidor que cabe exatamente aqui e não tem slide, então você a conta olhando para a tela do planejamento. Horas antes desta palestra, uma execução classificou o repositório como "existing .NET 8 catalog API". O main dele tem dois arquivos. O que o intake leu foi a saída da execução ANTERIOR: o clone é reaproveitado entre execuções e tinha ficado no branch de integração da última. A primeira decisão do pipeline inteiro — greenfield ou brownfield — vinha de estado local que ninguém mergeou. O remate: "o modelo estava certo; o que eu dei para ele ler é que estava errado". Se preferir dar slide a ela, troque pelo achado 4 ou pelo 5 — são os mais específicos de Windows.</w:t>
+      </w:r>
+    </w:p>
+    <w:p>
+      <w:pPr>
         <w:spacing w:after="100" w:before="0"/>
       </w:pPr>
       <w:r>

</xml_diff>

<commit_message>
docs: bio do palestrante, sem foto, e a resposta do "quanto tempo levou"
Texto do próprio Alexandre, literal. A foto sai por escolha dele, então o
slide reflui para a largura inteira e o tipo cresce — um slide de
apresentação com um vazio de três polegadas à esquerda parece defeito, e
este é o primeiro que a plateia lê com atenção.

Os chips de rede ganharam largura explícita: a automática é calibrada para
13pt e cortaria o texto em 15pt.

E a pergunta que estava esperando resposta agora tem uma: a primeira
versão do produto saiu em uma manhã. O que consumiu o resto do tempo foi
integração, não prompt — os oito achados da palestra saíram todos dessa
parte, nenhum da manhã.

Não sobrou marcador em slide nenhum.

Co-Authored-By: Claude Opus 5 (1M context) <noreply@anthropic.com>
</commit_message>
<xml_diff>
--- a/docs/apresentacao/Roteiro-Agent-Squad-TDC-SP-2026.docx
+++ b/docs/apresentacao/Roteiro-Agent-Squad-TDC-SP-2026.docx
@@ -112,27 +112,27 @@
       <w:pPr>
         <w:spacing w:before="180" w:after="0"/>
         <w:ind w:left="113"/>
-        <w:shd w:val="clear" w:fill="FDECEC"/>
+        <w:shd w:val="clear" w:fill="EAF7EE"/>
         <w:pBdr>
-          <w:left w:val="single" w:sz="18" w:space="8" w:color="B32D2D"/>
+          <w:left w:val="single" w:sz="18" w:space="8" w:color="1B7F3B"/>
         </w:pBdr>
       </w:pPr>
       <w:r>
         <w:rPr>
           <w:b/>
-          <w:color w:val="B32D2D"/>
+          <w:color w:val="1B7F3B"/>
           <w:sz w:val="21"/>
         </w:rPr>
-        <w:t>Antes de tudo: preencha o slide 2</w:t>
+        <w:t>O slide 2 está pronto</w:t>
       </w:r>
     </w:p>
     <w:p>
       <w:pPr>
         <w:spacing w:before="0" w:after="200"/>
         <w:ind w:left="113"/>
-        <w:shd w:val="clear" w:fill="FDECEC"/>
+        <w:shd w:val="clear" w:fill="EAF7EE"/>
         <w:pBdr>
-          <w:left w:val="single" w:sz="18" w:space="8" w:color="B32D2D"/>
+          <w:left w:val="single" w:sz="18" w:space="8" w:color="1B7F3B"/>
         </w:pBdr>
       </w:pPr>
       <w:r>
@@ -140,7 +140,7 @@
           <w:color w:val="1A1D22"/>
           <w:sz w:val="21"/>
         </w:rPr>
-        <w:t>O slide 'Quem está falando' está com marcadores — [SEU CARGO], [SUA EMPRESA], a bio e os seus perfis. Preencha e coloque sua foto antes de subir. É o único slide que eu não consigo escrever por você.</w:t>
+        <w:t>Nome, cargo, bio e perfis preenchidos, sem foto — como você pediu. Não sobrou marcador em nenhum slide. Se quiser mexer em alguma palavra da bio, é edição direta no PowerPoint; o resto do deck não depende dela.</w:t>
       </w:r>
     </w:p>
     <w:p>
@@ -4757,7 +4757,7 @@
           <w:color w:val="1A1D22"/>
           <w:sz w:val="21"/>
         </w:rPr>
-        <w:t>[Preencha com a sua resposta honesta.] E diga o que realmente consumiu o tempo: não foi prompt, foi integração — versão de pacote, permissão, layout de runtime, hierarquia de autoridade.</w:t>
+        <w:t>Cheguei na primeira versão do produto em uma manhã. O resto do dia foi o que realmente consumiu tempo, e não foi prompt: foi integração — versão de pacote, permissão, layout de runtime, hierarquia de autoridade. Os oito achados da palestra saíram todos dessa parte, nenhum da manhã.</w:t>
       </w:r>
     </w:p>
     <w:p>

</xml_diff>